<commit_message>
Update Terms & Conditions from the revised source doc
- Add clause 2.8 (Fraud, misuse & membership termination).
- Rewrite section 5 (Service discrepancy & reimbursement): operational
  restrictions now explicitly excluded; claim submission requires flight
  number + date, payment receipt, and baggage tag slip; add 5.4 fraud /
  claim forfeiture. Matches content/BELSALAMEH TERMS & CONDITIONS.docx.
</commit_message>
<xml_diff>
--- a/content/BELSALAMEH  TERMS & CONDITIONS.docx
+++ b/content/BELSALAMEH  TERMS & CONDITIONS.docx
@@ -394,41 +394,6 @@
     <w:p>
       <w:pPr>
         <w:pStyle w:val="Body"/>
-        <w:rPr>
-          <w:b w:val="1"/>
-          <w:bCs w:val="1"/>
-        </w:rPr>
-      </w:pPr>
-      <w:r>
-        <w:rPr>
-          <w:b w:val="1"/>
-          <w:bCs w:val="1"/>
-          <w:rtl w:val="0"/>
-          <w:lang w:val="en-US"/>
-        </w:rPr>
-        <w:t>3. Launch Service Terms (1</w:t>
-      </w:r>
-      <w:r>
-        <w:rPr>
-          <w:b w:val="1"/>
-          <w:bCs w:val="1"/>
-          <w:rtl w:val="0"/>
-        </w:rPr>
-        <w:t>–</w:t>
-      </w:r>
-      <w:r>
-        <w:rPr>
-          <w:b w:val="1"/>
-          <w:bCs w:val="1"/>
-          <w:rtl w:val="0"/>
-          <w:lang w:val="en-US"/>
-        </w:rPr>
-        <w:t>4 kg Micro-Excess Baggage Service)</w:t>
-      </w:r>
-    </w:p>
-    <w:p>
-      <w:pPr>
-        <w:pStyle w:val="Body"/>
         <w:numPr>
           <w:ilvl w:val="0"/>
           <w:numId w:val="2"/>
@@ -442,29 +407,49 @@
           <w:rtl w:val="0"/>
           <w:lang w:val="en-US"/>
         </w:rPr>
-        <w:t>3.1 Operational Eligibility:</w:t>
-      </w:r>
-      <w:r>
-        <w:rPr>
-          <w:rtl w:val="0"/>
-          <w:lang w:val="en-US"/>
-        </w:rPr>
-        <w:t xml:space="preserve"> The inaugural Micro-Excess Baggage Service is valid strictly on flights operated directly by founding partner </w:t>
-      </w:r>
-      <w:r>
-        <w:rPr>
-          <w:b w:val="1"/>
-          <w:bCs w:val="1"/>
-          <w:rtl w:val="0"/>
-        </w:rPr>
-        <w:t>Royal Jordanian</w:t>
-      </w:r>
-      <w:r>
-        <w:rPr>
-          <w:rtl w:val="0"/>
-          <w:lang w:val="en-US"/>
-        </w:rPr>
-        <w:t>, where the passenger's Booking Reference / PNR begins with "RJ".</w:t>
+        <w:t>2.8 Fraud, Misuse &amp; Membership Termination:</w:t>
+      </w:r>
+      <w:r>
+        <w:rPr>
+          <w:rtl w:val="0"/>
+          <w:lang w:val="en-US"/>
+        </w:rPr>
+        <w:t xml:space="preserve"> Belsalameh reserves the right to immediately terminate or revoke any active membership without refund or prior notice if a member engages in fraudulent activity, deliberate misrepresentation of passenger identity (including mismatching passport details), altered confirmation emails, or abuse of platform privileges. Any attempt to bypass platform policies or fraudulently exploit airline counter verification may be subject to applicable legal action under governing commercial and digital anti-fraud laws.</w:t>
+      </w:r>
+    </w:p>
+    <w:p>
+      <w:pPr>
+        <w:pStyle w:val="Body"/>
+        <w:rPr>
+          <w:b w:val="1"/>
+          <w:bCs w:val="1"/>
+        </w:rPr>
+      </w:pPr>
+      <w:r>
+        <w:rPr>
+          <w:b w:val="1"/>
+          <w:bCs w:val="1"/>
+          <w:rtl w:val="0"/>
+          <w:lang w:val="en-US"/>
+        </w:rPr>
+        <w:t>3. Launch Service Terms (1</w:t>
+      </w:r>
+      <w:r>
+        <w:rPr>
+          <w:b w:val="1"/>
+          <w:bCs w:val="1"/>
+          <w:rtl w:val="0"/>
+        </w:rPr>
+        <w:t>–</w:t>
+      </w:r>
+      <w:r>
+        <w:rPr>
+          <w:b w:val="1"/>
+          <w:bCs w:val="1"/>
+          <w:rtl w:val="0"/>
+          <w:lang w:val="en-US"/>
+        </w:rPr>
+        <w:t>4 kg Micro-Excess Baggage Service)</w:t>
       </w:r>
     </w:p>
     <w:p>
@@ -483,14 +468,29 @@
           <w:rtl w:val="0"/>
           <w:lang w:val="en-US"/>
         </w:rPr>
-        <w:t>3.2 Ineligible Routes &amp; Booking Types:</w:t>
-      </w:r>
-      <w:r>
-        <w:rPr>
-          <w:rtl w:val="0"/>
-          <w:lang w:val="en-US"/>
-        </w:rPr>
-        <w:t xml:space="preserve"> Codeshare flights operated by partner carriers, interline itineraries involving secondary airlines, and multi-airline tickets are strictly excluded from service coverage.</w:t>
+        <w:t>3.1 Operational Eligibility:</w:t>
+      </w:r>
+      <w:r>
+        <w:rPr>
+          <w:rtl w:val="0"/>
+          <w:lang w:val="en-US"/>
+        </w:rPr>
+        <w:t xml:space="preserve"> The inaugural Micro-Excess Baggage Service is valid strictly on flights operated directly by founding partner </w:t>
+      </w:r>
+      <w:r>
+        <w:rPr>
+          <w:b w:val="1"/>
+          <w:bCs w:val="1"/>
+          <w:rtl w:val="0"/>
+        </w:rPr>
+        <w:t>Royal Jordanian</w:t>
+      </w:r>
+      <w:r>
+        <w:rPr>
+          <w:rtl w:val="0"/>
+          <w:lang w:val="en-US"/>
+        </w:rPr>
+        <w:t>, where the passenger's Booking Reference / PNR begins with "RJ".</w:t>
       </w:r>
     </w:p>
     <w:p>
@@ -509,29 +509,14 @@
           <w:rtl w:val="0"/>
           <w:lang w:val="en-US"/>
         </w:rPr>
-        <w:t>3.3 Weight Allowance &amp; Capping:</w:t>
-      </w:r>
-      <w:r>
-        <w:rPr>
-          <w:rtl w:val="0"/>
-          <w:lang w:val="en-US"/>
-        </w:rPr>
-        <w:t xml:space="preserve"> The launch service covers minor excess luggage weighing between 1.00 kg and 4.00 kg over the standard allowance, capping total checked bag weight at a maximum of </w:t>
-      </w:r>
-      <w:r>
-        <w:rPr>
-          <w:b w:val="1"/>
-          <w:bCs w:val="1"/>
-          <w:rtl w:val="0"/>
-        </w:rPr>
-        <w:t>27.00 kg</w:t>
-      </w:r>
-      <w:r>
-        <w:rPr>
-          <w:rtl w:val="0"/>
-          <w:lang w:val="en-US"/>
-        </w:rPr>
-        <w:t>. Any luggage weighing over 27.00 kg total remains subject to standard published airline excess baggage fees and airport counter policies.</w:t>
+        <w:t>3.2 Ineligible Routes &amp; Booking Types:</w:t>
+      </w:r>
+      <w:r>
+        <w:rPr>
+          <w:rtl w:val="0"/>
+          <w:lang w:val="en-US"/>
+        </w:rPr>
+        <w:t xml:space="preserve"> Codeshare flights operated by partner carriers, interline itineraries involving secondary airlines, and multi-airline tickets are strictly excluded from service coverage.</w:t>
       </w:r>
     </w:p>
     <w:p>
@@ -550,48 +535,29 @@
           <w:rtl w:val="0"/>
           <w:lang w:val="en-US"/>
         </w:rPr>
-        <w:t>3.4 Account Capping &amp; Companions:</w:t>
-      </w:r>
-      <w:r>
-        <w:rPr>
-          <w:rtl w:val="0"/>
-          <w:lang w:val="en-US"/>
-        </w:rPr>
-        <w:t xml:space="preserve"> For the launch service, protection is strictly capped at </w:t>
-      </w:r>
-      <w:r>
-        <w:rPr>
-          <w:b w:val="1"/>
-          <w:bCs w:val="1"/>
-          <w:rtl w:val="0"/>
-          <w:lang w:val="en-US"/>
-        </w:rPr>
-        <w:t>one (1) checked bag per active member</w:t>
-      </w:r>
-      <w:r>
-        <w:rPr>
-          <w:rtl w:val="0"/>
-          <w:lang w:val="en-US"/>
-        </w:rPr>
-        <w:t xml:space="preserve"> (matching the passport name provided during payment, not per PNR or booking group). Travel companions sharing the same booking reference cannot utilize a member's service unless they hold an active individual Belsalameh membership.</w:t>
-      </w:r>
-    </w:p>
-    <w:p>
-      <w:pPr>
-        <w:pStyle w:val="Body"/>
-        <w:rPr>
-          <w:b w:val="1"/>
-          <w:bCs w:val="1"/>
-        </w:rPr>
-      </w:pPr>
-      <w:r>
-        <w:rPr>
-          <w:b w:val="1"/>
-          <w:bCs w:val="1"/>
-          <w:rtl w:val="0"/>
-          <w:lang w:val="en-US"/>
-        </w:rPr>
-        <w:t>4. Counter Payments, Operational Disclaimers &amp; Currency Charges</w:t>
+        <w:t>3.3 Weight Allowance &amp; Capping:</w:t>
+      </w:r>
+      <w:r>
+        <w:rPr>
+          <w:rtl w:val="0"/>
+          <w:lang w:val="en-US"/>
+        </w:rPr>
+        <w:t xml:space="preserve"> The launch service covers minor excess luggage weighing between 1.00 kg and 4.00 kg over the standard allowance, capping total checked bag weight at a maximum of </w:t>
+      </w:r>
+      <w:r>
+        <w:rPr>
+          <w:b w:val="1"/>
+          <w:bCs w:val="1"/>
+          <w:rtl w:val="0"/>
+        </w:rPr>
+        <w:t>27.00 kg</w:t>
+      </w:r>
+      <w:r>
+        <w:rPr>
+          <w:rtl w:val="0"/>
+          <w:lang w:val="en-US"/>
+        </w:rPr>
+        <w:t>. Any luggage weighing over 27.00 kg total remains subject to standard published airline excess baggage fees and airport counter policies.</w:t>
       </w:r>
     </w:p>
     <w:p>
@@ -610,14 +576,48 @@
           <w:rtl w:val="0"/>
           <w:lang w:val="en-US"/>
         </w:rPr>
-        <w:t>4.1 Counter-Level Payment Model:</w:t>
-      </w:r>
-      <w:r>
-        <w:rPr>
-          <w:rtl w:val="0"/>
-          <w:lang w:val="en-US"/>
-        </w:rPr>
-        <w:t xml:space="preserve"> Belsalameh does not charge or collect payments for airline airport services online. All protected flat rates for micro-services are paid by the member directly to the operating airline check-in agent at the airport counter upon arrival.</w:t>
+        <w:t>3.4 Account Capping &amp; Companions:</w:t>
+      </w:r>
+      <w:r>
+        <w:rPr>
+          <w:rtl w:val="0"/>
+          <w:lang w:val="en-US"/>
+        </w:rPr>
+        <w:t xml:space="preserve"> For the launch service, protection is strictly capped at </w:t>
+      </w:r>
+      <w:r>
+        <w:rPr>
+          <w:b w:val="1"/>
+          <w:bCs w:val="1"/>
+          <w:rtl w:val="0"/>
+          <w:lang w:val="en-US"/>
+        </w:rPr>
+        <w:t>one (1) checked bag per active member</w:t>
+      </w:r>
+      <w:r>
+        <w:rPr>
+          <w:rtl w:val="0"/>
+          <w:lang w:val="en-US"/>
+        </w:rPr>
+        <w:t xml:space="preserve"> (matching the passport name provided during payment, not per PNR or booking group). Travel companions sharing the same booking reference cannot utilize a member's service unless they hold an active individual Belsalameh membership.</w:t>
+      </w:r>
+    </w:p>
+    <w:p>
+      <w:pPr>
+        <w:pStyle w:val="Body"/>
+        <w:rPr>
+          <w:b w:val="1"/>
+          <w:bCs w:val="1"/>
+        </w:rPr>
+      </w:pPr>
+      <w:r>
+        <w:rPr>
+          <w:b w:val="1"/>
+          <w:bCs w:val="1"/>
+          <w:rtl w:val="0"/>
+          <w:lang w:val="en-US"/>
+        </w:rPr>
+        <w:t>4. Counter Payments, Operational Disclaimers &amp; Currency Charges</w:t>
       </w:r>
     </w:p>
     <w:p>
@@ -636,42 +636,14 @@
           <w:rtl w:val="0"/>
           <w:lang w:val="en-US"/>
         </w:rPr>
-        <w:t>4.2 Airline Operational Caps &amp; Disclaimers:</w:t>
-      </w:r>
-      <w:r>
-        <w:rPr>
-          <w:rtl w:val="0"/>
-          <w:lang w:val="en-US"/>
-        </w:rPr>
-        <w:t xml:space="preserve"> All airport micro-services are provided and fulfilled under the direct operational authority of operating airlines. Due to operational factors</w:t>
-      </w:r>
-      <w:r>
-        <w:rPr>
-          <w:rtl w:val="0"/>
-          <w:lang w:val="en-US"/>
-        </w:rPr>
-        <w:t>—</w:t>
-      </w:r>
-      <w:r>
-        <w:rPr>
-          <w:rtl w:val="0"/>
-          <w:lang w:val="en-US"/>
-        </w:rPr>
-        <w:t>including aircraft payload limits, route weight restrictions, or peak travel seasons</w:t>
-      </w:r>
-      <w:r>
-        <w:rPr>
-          <w:rtl w:val="0"/>
-          <w:lang w:val="en-US"/>
-        </w:rPr>
-        <w:t>—</w:t>
-      </w:r>
-      <w:r>
-        <w:rPr>
-          <w:rtl w:val="0"/>
-          <w:lang w:val="en-US"/>
-        </w:rPr>
-        <w:t>airlines reserve the right to temporarily restrict or cap services. Because Belsalameh operates on a direct counter payment model upon arrival, members will never pay for a service that is operationally unavailable.</w:t>
+        <w:t>4.1 Counter-Level Payment Model:</w:t>
+      </w:r>
+      <w:r>
+        <w:rPr>
+          <w:rtl w:val="0"/>
+          <w:lang w:val="en-US"/>
+        </w:rPr>
+        <w:t xml:space="preserve"> Belsalameh does not charge or collect payments for airline airport services online. All protected flat rates for micro-services are paid by the member directly to the operating airline check-in agent at the airport counter upon arrival.</w:t>
       </w:r>
     </w:p>
     <w:p>
@@ -690,32 +662,42 @@
           <w:rtl w:val="0"/>
           <w:lang w:val="en-US"/>
         </w:rPr>
-        <w:t>4.3 Airport Payment Methods &amp; Processing Fees:</w:t>
-      </w:r>
-      <w:r>
-        <w:rPr>
-          <w:rtl w:val="0"/>
-          <w:lang w:val="en-US"/>
-        </w:rPr>
-        <w:t xml:space="preserve"> Counter payments are subject to local airport terminal payment constraints (e.g., credit card-only counters or local currency requirements). Members acknowledge that foreign exchange (FX) currency conversions or card issuer processing fees applied by airport payment terminals represent external operational variances beyond our fixed member rates.</w:t>
-      </w:r>
-    </w:p>
-    <w:p>
-      <w:pPr>
-        <w:pStyle w:val="Body"/>
-        <w:rPr>
-          <w:b w:val="1"/>
-          <w:bCs w:val="1"/>
-        </w:rPr>
-      </w:pPr>
-      <w:r>
-        <w:rPr>
-          <w:b w:val="1"/>
-          <w:bCs w:val="1"/>
-          <w:rtl w:val="0"/>
-          <w:lang w:val="en-US"/>
-        </w:rPr>
-        <w:t>5. Service Discrepancy &amp; Reimbursement Resolution</w:t>
+        <w:t>4.2 Airline Operational Caps &amp; Disclaimers:</w:t>
+      </w:r>
+      <w:r>
+        <w:rPr>
+          <w:rtl w:val="0"/>
+          <w:lang w:val="en-US"/>
+        </w:rPr>
+        <w:t xml:space="preserve"> All airport micro-services are provided and fulfilled under the direct operational authority of operating airlines. Due to operational factors</w:t>
+      </w:r>
+      <w:r>
+        <w:rPr>
+          <w:rtl w:val="0"/>
+          <w:lang w:val="en-US"/>
+        </w:rPr>
+        <w:t>—</w:t>
+      </w:r>
+      <w:r>
+        <w:rPr>
+          <w:rtl w:val="0"/>
+          <w:lang w:val="en-US"/>
+        </w:rPr>
+        <w:t>including aircraft payload limits, route weight restrictions, or peak travel seasons</w:t>
+      </w:r>
+      <w:r>
+        <w:rPr>
+          <w:rtl w:val="0"/>
+          <w:lang w:val="en-US"/>
+        </w:rPr>
+        <w:t>—</w:t>
+      </w:r>
+      <w:r>
+        <w:rPr>
+          <w:rtl w:val="0"/>
+          <w:lang w:val="en-US"/>
+        </w:rPr>
+        <w:t>airlines reserve the right to temporarily restrict or cap services. Because Belsalameh operates on a direct counter payment model upon arrival, members will never pay for a service that is operationally unavailable.</w:t>
       </w:r>
     </w:p>
     <w:p>
@@ -732,16 +714,34 @@
           <w:b w:val="1"/>
           <w:bCs w:val="1"/>
           <w:rtl w:val="0"/>
-          <w:lang w:val="de-DE"/>
-        </w:rPr>
-        <w:t>5.1 Procedure for Denied Counter Privileges:</w:t>
-      </w:r>
-      <w:r>
-        <w:rPr>
-          <w:rtl w:val="0"/>
-          <w:lang w:val="en-US"/>
-        </w:rPr>
-        <w:t xml:space="preserve"> In the rare event that a check-in agent is unfamiliar with Belsalameh or charges standard airline rates on an eligible RJ-operated flight, the member should pay the required counter fee to proceed with their travel and retain all receipts.</w:t>
+          <w:lang w:val="en-US"/>
+        </w:rPr>
+        <w:t>4.3 Airport Payment Methods &amp; Processing Fees:</w:t>
+      </w:r>
+      <w:r>
+        <w:rPr>
+          <w:rtl w:val="0"/>
+          <w:lang w:val="en-US"/>
+        </w:rPr>
+        <w:t xml:space="preserve"> Counter payments are subject to local airport terminal payment constraints (e.g., credit card-only counters or local currency requirements). Members acknowledge that foreign exchange (FX) currency conversions or card issuer processing fees applied by airport payment terminals represent external operational variances beyond our fixed member rates.</w:t>
+      </w:r>
+    </w:p>
+    <w:p>
+      <w:pPr>
+        <w:pStyle w:val="Body"/>
+        <w:rPr>
+          <w:b w:val="1"/>
+          <w:bCs w:val="1"/>
+        </w:rPr>
+      </w:pPr>
+      <w:r>
+        <w:rPr>
+          <w:b w:val="1"/>
+          <w:bCs w:val="1"/>
+          <w:rtl w:val="0"/>
+          <w:lang w:val="en-US"/>
+        </w:rPr>
+        <w:t>5. Service Discrepancy &amp; Reimbursement Resolution</w:t>
       </w:r>
     </w:p>
     <w:p>
@@ -760,6 +760,64 @@
           <w:rtl w:val="0"/>
           <w:lang w:val="en-US"/>
         </w:rPr>
+        <w:t>5.1 Operational Restrictions Excluded:</w:t>
+      </w:r>
+      <w:r>
+        <w:rPr>
+          <w:rtl w:val="0"/>
+          <w:lang w:val="en-US"/>
+        </w:rPr>
+        <w:t xml:space="preserve"> Direct monetary reimbursement applies </w:t>
+      </w:r>
+      <w:r>
+        <w:rPr>
+          <w:b w:val="1"/>
+          <w:bCs w:val="1"/>
+          <w:rtl w:val="0"/>
+          <w:lang w:val="en-US"/>
+        </w:rPr>
+        <w:t>strictly and exclusively</w:t>
+      </w:r>
+      <w:r>
+        <w:rPr>
+          <w:rtl w:val="0"/>
+          <w:lang w:val="en-US"/>
+        </w:rPr>
+        <w:t xml:space="preserve"> to verified instances where an airport check-in agent fails or refuses to recognize an active Belsalameh membership on an eligible flight. Reimbursement does </w:t>
+      </w:r>
+      <w:r>
+        <w:rPr>
+          <w:b w:val="1"/>
+          <w:bCs w:val="1"/>
+          <w:rtl w:val="0"/>
+          <w:lang w:val="en-US"/>
+        </w:rPr>
+        <w:t>not</w:t>
+      </w:r>
+      <w:r>
+        <w:rPr>
+          <w:rtl w:val="0"/>
+          <w:lang w:val="en-US"/>
+        </w:rPr>
+        <w:t xml:space="preserve"> apply to service unavailability resulting from operating carrier operational restrictions, including but not limited to aircraft payload limits, route weight caps, peak seasonal restrictions, or bags exceeding the 27.00 kg maximum limit.</w:t>
+      </w:r>
+    </w:p>
+    <w:p>
+      <w:pPr>
+        <w:pStyle w:val="Body"/>
+        <w:numPr>
+          <w:ilvl w:val="0"/>
+          <w:numId w:val="2"/>
+        </w:numPr>
+        <w:bidi w:val="0"/>
+      </w:pPr>
+      <w:r>
+        <w:rPr>
+          <w:b w:val="1"/>
+          <w:bCs w:val="1"/>
+          <w:rtl w:val="0"/>
+          <w:lang w:val="en-US"/>
+        </w:rPr>
         <w:t>5.2 Claim Submission Requirements:</w:t>
       </w:r>
       <w:r>
@@ -767,7 +825,23 @@
           <w:rtl w:val="0"/>
           <w:lang w:val="en-US"/>
         </w:rPr>
-        <w:t xml:space="preserve"> Members must file a claim with our help team within </w:t>
+        <w:t xml:space="preserve"> In the rare event that a check-in agent refuses to recognize an active membership on an eligible flight, the member should pay the required airline counter fee to proceed with travel, retain all documentation, and submit a claim to </w:t>
+      </w:r>
+      <w:r>
+        <w:rPr>
+          <w:b w:val="1"/>
+          <w:bCs w:val="1"/>
+          <w:rtl w:val="0"/>
+          <w:lang w:val="de-DE"/>
+        </w:rPr>
+        <w:t>help@blsalameh.com</w:t>
+      </w:r>
+      <w:r>
+        <w:rPr>
+          <w:rtl w:val="0"/>
+          <w:lang w:val="en-US"/>
+        </w:rPr>
+        <w:t xml:space="preserve"> within </w:t>
       </w:r>
       <w:r>
         <w:rPr>
@@ -783,23 +857,7 @@
           <w:rtl w:val="0"/>
           <w:lang w:val="en-US"/>
         </w:rPr>
-        <w:t xml:space="preserve"> by emailing </w:t>
-      </w:r>
-      <w:r>
-        <w:rPr>
-          <w:b w:val="1"/>
-          <w:bCs w:val="1"/>
-          <w:rtl w:val="0"/>
-          <w:lang w:val="de-DE"/>
-        </w:rPr>
-        <w:t>help@blsalameh.com</w:t>
-      </w:r>
-      <w:r>
-        <w:rPr>
-          <w:rtl w:val="0"/>
-          <w:lang w:val="en-US"/>
-        </w:rPr>
-        <w:t xml:space="preserve"> and submitting:</w:t>
+        <w:t>. The claim email must include:</w:t>
       </w:r>
     </w:p>
     <w:p>
@@ -813,10 +871,19 @@
       </w:pPr>
       <w:r>
         <w:rPr>
-          <w:rtl w:val="0"/>
-          <w:lang w:val="en-US"/>
-        </w:rPr>
-        <w:t>Official airline payment receipt showing counter charges paid under the member's full name.</w:t>
+          <w:b w:val="1"/>
+          <w:bCs w:val="1"/>
+          <w:rtl w:val="0"/>
+          <w:lang w:val="en-US"/>
+        </w:rPr>
+        <w:t>Flight Number &amp; Flight Date</w:t>
+      </w:r>
+      <w:r>
+        <w:rPr>
+          <w:rtl w:val="0"/>
+          <w:lang w:val="en-US"/>
+        </w:rPr>
+        <w:t xml:space="preserve"> (required to verify flight eligibility and cross-reference carrier operational logs for restrictions active at departure).</w:t>
       </w:r>
     </w:p>
     <w:p>
@@ -830,10 +897,45 @@
       </w:pPr>
       <w:r>
         <w:rPr>
-          <w:rtl w:val="0"/>
-          <w:lang w:val="en-US"/>
-        </w:rPr>
-        <w:t xml:space="preserve">Official airline baggage tag slip proving the checked bag weighed </w:t>
+          <w:b w:val="1"/>
+          <w:bCs w:val="1"/>
+          <w:rtl w:val="0"/>
+          <w:lang w:val="en-US"/>
+        </w:rPr>
+        <w:t>Official Airline Payment Receipt</w:t>
+      </w:r>
+      <w:r>
+        <w:rPr>
+          <w:rtl w:val="0"/>
+          <w:lang w:val="en-US"/>
+        </w:rPr>
+        <w:t xml:space="preserve"> showing counter charges paid under the member's full legal name.</w:t>
+      </w:r>
+    </w:p>
+    <w:p>
+      <w:pPr>
+        <w:pStyle w:val="Body"/>
+        <w:numPr>
+          <w:ilvl w:val="1"/>
+          <w:numId w:val="2"/>
+        </w:numPr>
+        <w:bidi w:val="0"/>
+      </w:pPr>
+      <w:r>
+        <w:rPr>
+          <w:b w:val="1"/>
+          <w:bCs w:val="1"/>
+          <w:rtl w:val="0"/>
+          <w:lang w:val="it-IT"/>
+        </w:rPr>
+        <w:t>Official Airline Baggage Tag Slip</w:t>
+      </w:r>
+      <w:r>
+        <w:rPr>
+          <w:rtl w:val="0"/>
+          <w:lang w:val="en-US"/>
+        </w:rPr>
+        <w:t xml:space="preserve"> proving the checked bag weighed </w:t>
       </w:r>
       <w:r>
         <w:rPr>
@@ -874,7 +976,7 @@
           <w:rtl w:val="0"/>
           <w:lang w:val="en-US"/>
         </w:rPr>
-        <w:t xml:space="preserve"> Belsalameh will review submitted claims and resolve discrepancies within </w:t>
+        <w:t xml:space="preserve"> Belsalameh will cross-verify the flight details against airline operational logs and resolve valid claims within </w:t>
       </w:r>
       <w:r>
         <w:rPr>
@@ -890,25 +992,7 @@
           <w:rtl w:val="0"/>
           <w:lang w:val="en-US"/>
         </w:rPr>
-        <w:t>. For all verified eligible claims, Belsalameh will issue direct monetary compensation to the member covering the exact price difference paid above the protected member rate.</w:t>
-      </w:r>
-    </w:p>
-    <w:p>
-      <w:pPr>
-        <w:pStyle w:val="Body"/>
-        <w:rPr>
-          <w:b w:val="1"/>
-          <w:bCs w:val="1"/>
-        </w:rPr>
-      </w:pPr>
-      <w:r>
-        <w:rPr>
-          <w:b w:val="1"/>
-          <w:bCs w:val="1"/>
-          <w:rtl w:val="0"/>
-          <w:lang w:val="en-US"/>
-        </w:rPr>
-        <w:t>6. Limitation of Liability</w:t>
+        <w:t>. For all verified claims where non-recognition occurred on an unrestricted eligible flight, Belsalameh will issue direct monetary compensation covering the exact price difference paid above the protected member rate.</w:t>
       </w:r>
     </w:p>
     <w:p>
@@ -925,16 +1009,34 @@
           <w:b w:val="1"/>
           <w:bCs w:val="1"/>
           <w:rtl w:val="0"/>
-          <w:lang w:val="en-US"/>
-        </w:rPr>
-        <w:t>6.1 Airline Operational Control:</w:t>
-      </w:r>
-      <w:r>
-        <w:rPr>
-          <w:rtl w:val="0"/>
-          <w:lang w:val="en-US"/>
-        </w:rPr>
-        <w:t xml:space="preserve"> Belsalameh holds no operational ownership, managerial control, or oversight over airline personnel, flight schedules, aircraft loading restrictions, or airport terminal operations. We are not liable for flight delays, flight cancellations, denied boarding, or luggage damage/loss caused by operating carriers.</w:t>
+          <w:lang w:val="de-DE"/>
+        </w:rPr>
+        <w:t>5.4 Fraud, Misuse &amp; Claim Forfeiture:</w:t>
+      </w:r>
+      <w:r>
+        <w:rPr>
+          <w:rtl w:val="0"/>
+          <w:lang w:val="en-US"/>
+        </w:rPr>
+        <w:t xml:space="preserve"> Any attempt to submit falsified payment receipts, altered baggage tags, or misrepresent flight dates/details will result in immediate claim denial, permanent revocation of Belsalameh membership without refund, and potential legal action under applicable anti-fraud regulations.</w:t>
+      </w:r>
+    </w:p>
+    <w:p>
+      <w:pPr>
+        <w:pStyle w:val="Body"/>
+        <w:rPr>
+          <w:b w:val="1"/>
+          <w:bCs w:val="1"/>
+        </w:rPr>
+      </w:pPr>
+      <w:r>
+        <w:rPr>
+          <w:b w:val="1"/>
+          <w:bCs w:val="1"/>
+          <w:rtl w:val="0"/>
+          <w:lang w:val="en-US"/>
+        </w:rPr>
+        <w:t>6. Limitation of Liability</w:t>
       </w:r>
     </w:p>
     <w:p>
@@ -953,6 +1055,32 @@
           <w:rtl w:val="0"/>
           <w:lang w:val="en-US"/>
         </w:rPr>
+        <w:t>6.1 Airline Operational Control:</w:t>
+      </w:r>
+      <w:r>
+        <w:rPr>
+          <w:rtl w:val="0"/>
+          <w:lang w:val="en-US"/>
+        </w:rPr>
+        <w:t xml:space="preserve"> Belsalameh holds no operational ownership, managerial control, or oversight over airline personnel, flight schedules, aircraft loading restrictions, or airport terminal operations. We are not liable for flight delays, flight cancellations, denied boarding, or luggage damage/loss caused by operating carriers.</w:t>
+      </w:r>
+    </w:p>
+    <w:p>
+      <w:pPr>
+        <w:pStyle w:val="Body"/>
+        <w:numPr>
+          <w:ilvl w:val="0"/>
+          <w:numId w:val="2"/>
+        </w:numPr>
+        <w:bidi w:val="0"/>
+      </w:pPr>
+      <w:r>
+        <w:rPr>
+          <w:b w:val="1"/>
+          <w:bCs w:val="1"/>
+          <w:rtl w:val="0"/>
+          <w:lang w:val="en-US"/>
+        </w:rPr>
         <w:t>6.2 Legal Liability Cap:</w:t>
       </w:r>
       <w:r>
@@ -1008,13 +1136,6 @@
         </w:rPr>
         <w:t>.</w:t>
       </w:r>
-    </w:p>
-    <w:p>
-      <w:pPr>
-        <w:pStyle w:val="Body"/>
-        <w:bidi w:val="0"/>
-      </w:pPr>
-      <w:r/>
     </w:p>
     <w:sectPr>
       <w:headerReference w:type="default" r:id="rId4"/>

</xml_diff>